<commit_message>
House Rules: forecasts must be falsifiable without invented percentages
</commit_message>
<xml_diff>
--- a/FinTech_Monitor_House_Rules.docx
+++ b/FinTech_Monitor_House_Rules.docx
@@ -130,13 +130,37 @@
         <w:t xml:space="preserve">“Our bet: by 2029…”</w:t>
       </w:r>
       <w:r>
-        <w:t xml:space="preserve">). Never state an invented statistic as fact — frame any forward</w:t>
-      </w:r>
-      <w:r>
-        <w:t xml:space="preserve"> </w:t>
-      </w:r>
-      <w:r>
-        <w:t xml:space="preserve">claim explicitly as a forecast. Imitate the voice reference’s rhythm, not its facts.</w:t>
+        <w:t xml:space="preserve">). The bet must be falsifiable WITHOUT an invented percentage —</w:t>
+      </w:r>
+      <w:r>
+        <w:t xml:space="preserve"> </w:t>
+      </w:r>
+      <w:r>
+        <w:t xml:space="preserve">prefer a discrete, checkable claim (e.g. </w:t>
+      </w:r>
+      <w:r>
+        <w:t xml:space="preserve">“the top 5 carriers will each acquire a lead-gen AI</w:t>
+      </w:r>
+      <w:r>
+        <w:t xml:space="preserve"> </w:t>
+      </w:r>
+      <w:r>
+        <w:t xml:space="preserve">platform”</w:t>
+      </w:r>
+      <w:r>
+        <w:t xml:space="preserve">) or a directional one (</w:t>
+      </w:r>
+      <w:r>
+        <w:t xml:space="preserve">“most…”</w:t>
+      </w:r>
+      <w:r>
+        <w:t xml:space="preserve">); never cite a specific % you cannot source. Never</w:t>
+      </w:r>
+      <w:r>
+        <w:t xml:space="preserve"> </w:t>
+      </w:r>
+      <w:r>
+        <w:t xml:space="preserve">state an invented statistic as fact. Imitate the voice reference’s rhythm, not its facts.</w:t>
       </w:r>
     </w:p>
     <w:p>

</xml_diff>